<commit_message>
keywords sorted, query costs added
</commit_message>
<xml_diff>
--- a/docs/API.docx
+++ b/docs/API.docx
@@ -34388,6 +34388,407 @@
         <w:t xml:space="preserve">Caching and cost model</w:t>
       </w:r>
     </w:p>
+    <w:p>
+      <w:pPr>
+        <w:pStyle w:val="FirstParagraph"/>
+      </w:pPr>
+      <w:r>
+        <w:rPr>
+          <w:b/>
+          <w:bCs/>
+        </w:rPr>
+        <w:t xml:space="preserve">At a glance — cost of pulling one field per exposure</w:t>
+      </w:r>
+      <w:r>
+        <w:t xml:space="preserve"> </w:t>
+      </w:r>
+      <w:r>
+        <w:t xml:space="preserve">(details below):</w:t>
+      </w:r>
+    </w:p>
+    <w:tbl>
+      <w:tblPr>
+        <w:tblStyle w:val="Table"/>
+        <w:tblW w:type="pct" w:w="5000"/>
+        <w:tblLayout w:type="fixed"/>
+        <w:tblLook w:firstRow="1" w:lastRow="0" w:firstColumn="0" w:lastColumn="0" w:noHBand="0" w:noVBand="0" w:val="0020"/>
+      </w:tblPr>
+      <w:tblGrid>
+        <w:gridCol w:w="3960"/>
+        <w:gridCol w:w="3960"/>
+      </w:tblGrid>
+      <w:tr>
+        <w:trPr>
+          <w:tblHeader w:val="on"/>
+        </w:trPr>
+        <w:tc>
+          <w:tcPr/>
+          <w:p>
+            <w:pPr>
+              <w:pStyle w:val="Compact"/>
+            </w:pPr>
+            <w:r>
+              <w:t xml:space="preserve">Source</w:t>
+            </w:r>
+          </w:p>
+        </w:tc>
+        <w:tc>
+          <w:tcPr/>
+          <w:p>
+            <w:pPr>
+              <w:pStyle w:val="Compact"/>
+            </w:pPr>
+            <w:r>
+              <w:t xml:space="preserve">Cost per exposure</w:t>
+            </w:r>
+          </w:p>
+        </w:tc>
+      </w:tr>
+      <w:tr>
+        <w:tc>
+          <w:tcPr/>
+          <w:p>
+            <w:pPr>
+              <w:pStyle w:val="Compact"/>
+            </w:pPr>
+            <w:r>
+              <w:rPr>
+                <w:rStyle w:val="VerbatimChar"/>
+              </w:rPr>
+              <w:t xml:space="preserve">db_row.&lt;col&gt;</w:t>
+            </w:r>
+            <w:r>
+              <w:t xml:space="preserve"> </w:t>
+            </w:r>
+            <w:r>
+              <w:t xml:space="preserve">and jsonb blocks</w:t>
+            </w:r>
+          </w:p>
+        </w:tc>
+        <w:tc>
+          <w:tcPr/>
+          <w:p>
+            <w:pPr>
+              <w:pStyle w:val="Compact"/>
+            </w:pPr>
+            <w:r>
+              <w:rPr>
+                <w:b/>
+                <w:bCs/>
+              </w:rPr>
+              <w:t xml:space="preserve">cheapest</w:t>
+            </w:r>
+            <w:r>
+              <w:t xml:space="preserve"> </w:t>
+            </w:r>
+            <w:r>
+              <w:t xml:space="preserve">— one indexed lookup by primary key, and</w:t>
+            </w:r>
+            <w:r>
+              <w:t xml:space="preserve"> </w:t>
+            </w:r>
+            <w:r>
+              <w:rPr>
+                <w:b/>
+                <w:bCs/>
+              </w:rPr>
+              <w:t xml:space="preserve">free inside</w:t>
+            </w:r>
+            <w:r>
+              <w:rPr>
+                <w:b/>
+                <w:bCs/>
+              </w:rPr>
+              <w:t xml:space="preserve"> </w:t>
+            </w:r>
+            <w:r>
+              <w:rPr>
+                <w:rStyle w:val="VerbatimChar"/>
+                <w:b/>
+                <w:bCs/>
+              </w:rPr>
+              <w:t xml:space="preserve">select_exposures</w:t>
+            </w:r>
+            <w:r>
+              <w:t xml:space="preserve"> </w:t>
+            </w:r>
+            <w:r>
+              <w:t xml:space="preserve">(bundled in the one bulk WHERE query)</w:t>
+            </w:r>
+          </w:p>
+        </w:tc>
+      </w:tr>
+      <w:tr>
+        <w:tc>
+          <w:tcPr/>
+          <w:p>
+            <w:pPr>
+              <w:pStyle w:val="Compact"/>
+            </w:pPr>
+            <w:r>
+              <w:rPr>
+                <w:rStyle w:val="VerbatimChar"/>
+              </w:rPr>
+              <w:t xml:space="preserve">header.&lt;KEY&gt;</w:t>
+            </w:r>
+          </w:p>
+        </w:tc>
+        <w:tc>
+          <w:tcPr/>
+          <w:p>
+            <w:pPr>
+              <w:pStyle w:val="Compact"/>
+            </w:pPr>
+            <w:r>
+              <w:t xml:space="preserve">one FITS header open (a file read)</w:t>
+            </w:r>
+          </w:p>
+        </w:tc>
+      </w:tr>
+      <w:tr>
+        <w:tc>
+          <w:tcPr/>
+          <w:p>
+            <w:pPr>
+              <w:pStyle w:val="Compact"/>
+            </w:pPr>
+            <w:r>
+              <w:rPr>
+                <w:rStyle w:val="VerbatimChar"/>
+              </w:rPr>
+              <w:t xml:space="preserve">telemetry(...)</w:t>
+            </w:r>
+            <w:r>
+              <w:t xml:space="preserve"> </w:t>
+            </w:r>
+            <w:r>
+              <w:t xml:space="preserve">/</w:t>
+            </w:r>
+            <w:r>
+              <w:t xml:space="preserve"> </w:t>
+            </w:r>
+            <w:r>
+              <w:rPr>
+                <w:rStyle w:val="VerbatimChar"/>
+              </w:rPr>
+              <w:t xml:space="preserve">telemetry_field</w:t>
+            </w:r>
+          </w:p>
+        </w:tc>
+        <w:tc>
+          <w:tcPr/>
+          <w:p>
+            <w:pPr>
+              <w:pStyle w:val="Compact"/>
+            </w:pPr>
+            <w:r>
+              <w:t xml:space="preserve">one indexed time-range query (</w:t>
+            </w:r>
+            <w:r>
+              <w:rPr>
+                <w:rStyle w:val="VerbatimChar"/>
+              </w:rPr>
+              <w:t xml:space="preserve">nearest</w:t>
+            </w:r>
+            <w:r>
+              <w:t xml:space="preserve"> </w:t>
+            </w:r>
+            <w:r>
+              <w:t xml:space="preserve">runs two); fast each, but</w:t>
+            </w:r>
+            <w:r>
+              <w:t xml:space="preserve"> </w:t>
+            </w:r>
+            <w:r>
+              <w:rPr>
+                <w:b/>
+                <w:bCs/>
+              </w:rPr>
+              <w:t xml:space="preserve">one round-trip per exposure</w:t>
+            </w:r>
+          </w:p>
+        </w:tc>
+      </w:tr>
+      <w:tr>
+        <w:tc>
+          <w:tcPr/>
+          <w:p>
+            <w:pPr>
+              <w:pStyle w:val="Compact"/>
+            </w:pPr>
+            <w:r>
+              <w:rPr>
+                <w:rStyle w:val="VerbatimChar"/>
+              </w:rPr>
+              <w:t xml:space="preserve">redux_row</w:t>
+            </w:r>
+            <w:r>
+              <w:t xml:space="preserve"> </w:t>
+            </w:r>
+            <w:r>
+              <w:t xml:space="preserve">/</w:t>
+            </w:r>
+            <w:r>
+              <w:t xml:space="preserve"> </w:t>
+            </w:r>
+            <w:r>
+              <w:rPr>
+                <w:rStyle w:val="VerbatimChar"/>
+              </w:rPr>
+              <w:t xml:space="preserve">gfa_row</w:t>
+            </w:r>
+            <w:r>
+              <w:t xml:space="preserve"> </w:t>
+            </w:r>
+            <w:r>
+              <w:t xml:space="preserve">/</w:t>
+            </w:r>
+            <w:r>
+              <w:t xml:space="preserve"> </w:t>
+            </w:r>
+            <w:r>
+              <w:rPr>
+                <w:rStyle w:val="VerbatimChar"/>
+              </w:rPr>
+              <w:t xml:space="preserve">exposure_table_flags</w:t>
+            </w:r>
+          </w:p>
+        </w:tc>
+        <w:tc>
+          <w:tcPr/>
+          <w:p>
+            <w:pPr>
+              <w:pStyle w:val="Compact"/>
+            </w:pPr>
+            <w:r>
+              <w:t xml:space="preserve">a</w:t>
+            </w:r>
+            <w:r>
+              <w:t xml:space="preserve"> </w:t>
+            </w:r>
+            <w:r>
+              <w:rPr>
+                <w:b/>
+                <w:bCs/>
+              </w:rPr>
+              <w:t xml:space="preserve">big table read once per process</w:t>
+            </w:r>
+            <w:r>
+              <w:t xml:space="preserve">, then O(1) — first access pays it (~12 MB / ~400 MB), rest are free</w:t>
+            </w:r>
+          </w:p>
+        </w:tc>
+      </w:tr>
+      <w:tr>
+        <w:tc>
+          <w:tcPr/>
+          <w:p>
+            <w:pPr>
+              <w:pStyle w:val="Compact"/>
+            </w:pPr>
+            <w:r>
+              <w:rPr>
+                <w:rStyle w:val="VerbatimChar"/>
+              </w:rPr>
+              <w:t xml:space="preserve">fiberqa</w:t>
+            </w:r>
+            <w:r>
+              <w:t xml:space="preserve"> </w:t>
+            </w:r>
+            <w:r>
+              <w:t xml:space="preserve">/</w:t>
+            </w:r>
+            <w:r>
+              <w:t xml:space="preserve"> </w:t>
+            </w:r>
+            <w:r>
+              <w:rPr>
+                <w:rStyle w:val="VerbatimChar"/>
+              </w:rPr>
+              <w:t xml:space="preserve">petalqa</w:t>
+            </w:r>
+            <w:r>
+              <w:t xml:space="preserve"> </w:t>
+            </w:r>
+            <w:r>
+              <w:t xml:space="preserve">/</w:t>
+            </w:r>
+            <w:r>
+              <w:t xml:space="preserve"> </w:t>
+            </w:r>
+            <w:r>
+              <w:rPr>
+                <w:rStyle w:val="VerbatimChar"/>
+              </w:rPr>
+              <w:t xml:space="preserve">calibstars</w:t>
+            </w:r>
+          </w:p>
+        </w:tc>
+        <w:tc>
+          <w:tcPr/>
+          <w:p>
+            <w:pPr>
+              <w:pStyle w:val="Compact"/>
+            </w:pPr>
+            <w:r>
+              <w:t xml:space="preserve">one small per-exposure file open each</w:t>
+            </w:r>
+          </w:p>
+        </w:tc>
+      </w:tr>
+      <w:tr>
+        <w:tc>
+          <w:tcPr/>
+          <w:p>
+            <w:pPr>
+              <w:pStyle w:val="Compact"/>
+            </w:pPr>
+            <w:r>
+              <w:rPr>
+                <w:rStyle w:val="VerbatimChar"/>
+              </w:rPr>
+              <w:t xml:space="preserve">cframe_table(camera)</w:t>
+            </w:r>
+          </w:p>
+        </w:tc>
+        <w:tc>
+          <w:tcPr/>
+          <w:p>
+            <w:pPr>
+              <w:pStyle w:val="Compact"/>
+            </w:pPr>
+            <w:r>
+              <w:rPr>
+                <w:b/>
+                <w:bCs/>
+              </w:rPr>
+              <w:t xml:space="preserve">slowest</w:t>
+            </w:r>
+            <w:r>
+              <w:t xml:space="preserve"> </w:t>
+            </w:r>
+            <w:r>
+              <w:t xml:space="preserve">— gzip-decompresses a whole cframe file (~1–2.5 s each); use</w:t>
+            </w:r>
+            <w:r>
+              <w:t xml:space="preserve"> </w:t>
+            </w:r>
+            <w:r>
+              <w:rPr>
+                <w:rStyle w:val="VerbatimChar"/>
+              </w:rPr>
+              <w:t xml:space="preserve">cframe_tables([...])</w:t>
+            </w:r>
+            <w:r>
+              <w:t xml:space="preserve"> </w:t>
+            </w:r>
+            <w:r>
+              <w:t xml:space="preserve">for parallel-process reads</w:t>
+            </w:r>
+          </w:p>
+        </w:tc>
+      </w:tr>
+    </w:tbl>
     <w:p>
       <w:pPr>
         <w:pStyle w:val="Compact"/>

</xml_diff>

<commit_message>
Fiber-loss metrics: example notebooks, metrics/API docs, analysis scripts
</commit_message>
<xml_diff>
--- a/docs/API.docx
+++ b/docs/API.docx
@@ -2,7 +2,7 @@
 <file path=word/document.xml><?xml version="1.0" encoding="utf-8"?>
 <w:document xmlns:w="http://schemas.openxmlformats.org/wordprocessingml/2006/main" xmlns:m="http://schemas.openxmlformats.org/officeDocument/2006/math" xmlns:r="http://schemas.openxmlformats.org/officeDocument/2006/relationships" xmlns:o="urn:schemas-microsoft-com:office:office" xmlns:v="urn:schemas-microsoft-com:vml" xmlns:w10="urn:schemas-microsoft-com:office:word" xmlns:a="http://schemas.openxmlformats.org/drawingml/2006/main" xmlns:pic="http://schemas.openxmlformats.org/drawingml/2006/picture" xmlns:wp="http://schemas.openxmlformats.org/drawingml/2006/wordprocessingDrawing">
   <w:body>
-    <w:bookmarkStart w:id="57" w:name="telemetry_mining-api-reference"/>
+    <w:bookmarkStart w:id="58" w:name="telemetry_mining-api-reference"/>
     <w:p>
       <w:pPr>
         <w:pStyle w:val="Heading1"/>
@@ -816,6 +816,23 @@
             <w:rStyle w:val="Hyperlink"/>
           </w:rPr>
           <w:t xml:space="preserve">GFA offline summary</w:t>
+        </w:r>
+      </w:hyperlink>
+    </w:p>
+    <w:p>
+      <w:pPr>
+        <w:pStyle w:val="Compact"/>
+        <w:numPr>
+          <w:ilvl w:val="1"/>
+          <w:numId w:val="1002"/>
+        </w:numPr>
+      </w:pPr>
+      <w:hyperlink w:anchor="fiber-loss-metrics">
+        <w:r>
+          <w:rPr>
+            <w:rStyle w:val="Hyperlink"/>
+          </w:rPr>
+          <w:t xml:space="preserve">Fiber-loss metrics</w:t>
         </w:r>
       </w:hyperlink>
     </w:p>
@@ -1393,7 +1410,7 @@
       </w:hyperlink>
     </w:p>
     <w:bookmarkEnd w:id="12"/>
-    <w:bookmarkStart w:id="14" w:name="installation--environment"/>
+    <w:bookmarkStart w:id="14" w:name="installation-environment"/>
     <w:p>
       <w:pPr>
         <w:pStyle w:val="Heading2"/>
@@ -5095,7 +5112,7 @@
       </w:r>
     </w:p>
     <w:bookmarkEnd w:id="17"/>
-    <w:bookmarkStart w:id="37" w:name="exposure"/>
+    <w:bookmarkStart w:id="38" w:name="exposure"/>
     <w:p>
       <w:pPr>
         <w:pStyle w:val="Heading2"/>
@@ -12590,7 +12607,7 @@
       </w:r>
     </w:p>
     <w:bookmarkEnd w:id="27"/>
-    <w:bookmarkStart w:id="28" w:name="offline-qa--reduction-row"/>
+    <w:bookmarkStart w:id="28" w:name="offline-qa-reduction-row"/>
     <w:p>
       <w:pPr>
         <w:pStyle w:val="Heading3"/>
@@ -16346,7 +16363,615 @@
       </w:r>
     </w:p>
     <w:bookmarkEnd w:id="30"/>
-    <w:bookmarkStart w:id="31" w:name="fiberqa"/>
+    <w:bookmarkStart w:id="31" w:name="fiber-loss-metrics"/>
+    <w:p>
+      <w:pPr>
+        <w:pStyle w:val="Heading3"/>
+      </w:pPr>
+      <w:r>
+        <w:t xml:space="preserve">Fiber-loss metrics</w:t>
+      </w:r>
+    </w:p>
+    <w:p>
+      <w:pPr>
+        <w:pStyle w:val="SourceCode"/>
+      </w:pPr>
+      <w:r>
+        <w:rPr>
+          <w:rStyle w:val="NormalTok"/>
+        </w:rPr>
+        <w:t xml:space="preserve">exp.L_see        </w:t>
+      </w:r>
+      <w:r>
+        <w:rPr>
+          <w:rStyle w:val="CommentTok"/>
+        </w:rPr>
+        <w:t xml:space="preserve"># float: whole-array seeing loss level, or None</w:t>
+      </w:r>
+      <w:r>
+        <w:br/>
+      </w:r>
+      <w:r>
+        <w:rPr>
+          <w:rStyle w:val="NormalTok"/>
+        </w:rPr>
+        <w:t xml:space="preserve">exp.L_field      </w:t>
+      </w:r>
+      <w:r>
+        <w:rPr>
+          <w:rStyle w:val="CommentTok"/>
+        </w:rPr>
+        <w:t xml:space="preserve"># float: DAR field-distortion loss, or None</w:t>
+      </w:r>
+      <w:r>
+        <w:br/>
+      </w:r>
+      <w:r>
+        <w:rPr>
+          <w:rStyle w:val="NormalTok"/>
+        </w:rPr>
+        <w:t xml:space="preserve">exp.parallactic  </w:t>
+      </w:r>
+      <w:r>
+        <w:rPr>
+          <w:rStyle w:val="CommentTok"/>
+        </w:rPr>
+        <w:t xml:space="preserve"># float: parallactic angle in degrees, or None</w:t>
+      </w:r>
+    </w:p>
+    <w:p>
+      <w:pPr>
+        <w:pStyle w:val="FirstParagraph"/>
+      </w:pPr>
+      <w:r>
+        <w:t xml:space="preserve">Two artifact-free, GFA-imaging-based per-exposure fiber-loss metrics (full treatment, with construction and</w:t>
+      </w:r>
+      <w:r>
+        <w:t xml:space="preserve"> </w:t>
+      </w:r>
+      <w:r>
+        <w:t xml:space="preserve">use cases:</w:t>
+      </w:r>
+      <w:r>
+        <w:t xml:space="preserve"> </w:t>
+      </w:r>
+      <w:r>
+        <w:rPr>
+          <w:rStyle w:val="VerbatimChar"/>
+        </w:rPr>
+        <w:t xml:space="preserve">docs/FIBER_LOSS_METRICS.md</w:t>
+      </w:r>
+      <w:r>
+        <w:t xml:space="preserve">).</w:t>
+      </w:r>
+      <w:r>
+        <w:t xml:space="preserve"> </w:t>
+      </w:r>
+      <w:r>
+        <w:rPr>
+          <w:rStyle w:val="VerbatimChar"/>
+        </w:rPr>
+        <w:t xml:space="preserve">L_see</w:t>
+      </w:r>
+      <w:r>
+        <w:t xml:space="preserve"> </w:t>
+      </w:r>
+      <w:r>
+        <w:t xml:space="preserve">is the whole-array loss set by seeing (an artifact-free</w:t>
+      </w:r>
+      <w:r>
+        <w:t xml:space="preserve"> </w:t>
+      </w:r>
+      <w:r>
+        <w:rPr>
+          <w:rStyle w:val="VerbatimChar"/>
+        </w:rPr>
+        <w:t xml:space="preserve">RCALIBFRAC</w:t>
+      </w:r>
+      <w:r>
+        <w:t xml:space="preserve">-</w:t>
+      </w:r>
+      <w:r>
+        <w:rPr>
+          <w:i/>
+          <w:iCs/>
+        </w:rPr>
+        <w:t xml:space="preserve">level</w:t>
+      </w:r>
+      <w:r>
+        <w:t xml:space="preserve"> </w:t>
+      </w:r>
+      <w:r>
+        <w:t xml:space="preserve">replacement);</w:t>
+      </w:r>
+      <w:r>
+        <w:t xml:space="preserve"> </w:t>
+      </w:r>
+      <w:r>
+        <w:rPr>
+          <w:rStyle w:val="VerbatimChar"/>
+        </w:rPr>
+        <w:t xml:space="preserve">L_field</w:t>
+      </w:r>
+      <w:r>
+        <w:t xml:space="preserve"> </w:t>
+      </w:r>
+      <w:r>
+        <w:t xml:space="preserve">is the loss that</w:t>
+      </w:r>
+      <w:r>
+        <w:t xml:space="preserve"> </w:t>
+      </w:r>
+      <w:r>
+        <w:rPr>
+          <w:i/>
+          <w:iCs/>
+        </w:rPr>
+        <w:t xml:space="preserve">varies across the focal plane</w:t>
+      </w:r>
+      <w:r>
+        <w:t xml:space="preserve"> </w:t>
+      </w:r>
+      <w:r>
+        <w:t xml:space="preserve">from DAR field</w:t>
+      </w:r>
+      <w:r>
+        <w:t xml:space="preserve"> </w:t>
+      </w:r>
+      <w:r>
+        <w:t xml:space="preserve">distortion.</w:t>
+      </w:r>
+    </w:p>
+    <w:p>
+      <w:pPr>
+        <w:pStyle w:val="BodyText"/>
+      </w:pPr>
+      <w:r>
+        <w:t xml:space="preserve">Each property</w:t>
+      </w:r>
+      <w:r>
+        <w:t xml:space="preserve"> </w:t>
+      </w:r>
+      <w:r>
+        <w:rPr>
+          <w:b/>
+          <w:bCs/>
+        </w:rPr>
+        <w:t xml:space="preserve">computes directly</w:t>
+      </w:r>
+      <w:r>
+        <w:t xml:space="preserve"> </w:t>
+      </w:r>
+      <w:r>
+        <w:t xml:space="preserve">from the offline inputs; if those aren’t available at this site (or</w:t>
+      </w:r>
+      <w:r>
+        <w:t xml:space="preserve"> </w:t>
+      </w:r>
+      <w:r>
+        <w:rPr>
+          <w:rStyle w:val="VerbatimChar"/>
+        </w:rPr>
+        <w:t xml:space="preserve">desimodel</w:t>
+      </w:r>
+      <w:r>
+        <w:t xml:space="preserve"> </w:t>
+      </w:r>
+      <w:r>
+        <w:t xml:space="preserve">isn’t installed) it</w:t>
+      </w:r>
+      <w:r>
+        <w:t xml:space="preserve"> </w:t>
+      </w:r>
+      <w:r>
+        <w:rPr>
+          <w:b/>
+          <w:bCs/>
+        </w:rPr>
+        <w:t xml:space="preserve">falls back</w:t>
+      </w:r>
+      <w:r>
+        <w:t xml:space="preserve"> </w:t>
+      </w:r>
+      <w:r>
+        <w:t xml:space="preserve">to a precomputed</w:t>
+      </w:r>
+      <w:r>
+        <w:t xml:space="preserve"> </w:t>
+      </w:r>
+      <w:r>
+        <w:rPr>
+          <w:rStyle w:val="VerbatimChar"/>
+        </w:rPr>
+        <w:t xml:space="preserve">fiber_loss_metrics</w:t>
+      </w:r>
+      <w:r>
+        <w:t xml:space="preserve"> </w:t>
+      </w:r>
+      <w:r>
+        <w:t xml:space="preserve">table source if one is</w:t>
+      </w:r>
+      <w:r>
+        <w:t xml:space="preserve"> </w:t>
+      </w:r>
+      <w:r>
+        <w:t xml:space="preserve">registered, otherwise returns</w:t>
+      </w:r>
+      <w:r>
+        <w:t xml:space="preserve"> </w:t>
+      </w:r>
+      <w:r>
+        <w:rPr>
+          <w:rStyle w:val="VerbatimChar"/>
+        </w:rPr>
+        <w:t xml:space="preserve">None</w:t>
+      </w:r>
+      <w:r>
+        <w:t xml:space="preserve">. So the same attribute works at NERSC (direct) and KPNO (table), and the</w:t>
+      </w:r>
+      <w:r>
+        <w:t xml:space="preserve"> </w:t>
+      </w:r>
+      <w:r>
+        <w:t xml:space="preserve">two paths return identical values. Direct-path inputs:</w:t>
+      </w:r>
+      <w:r>
+        <w:t xml:space="preserve"> </w:t>
+      </w:r>
+      <w:r>
+        <w:rPr>
+          <w:rStyle w:val="VerbatimChar"/>
+        </w:rPr>
+        <w:t xml:space="preserve">L_see</w:t>
+      </w:r>
+      <w:r>
+        <w:t xml:space="preserve"> </w:t>
+      </w:r>
+      <w:r>
+        <w:t xml:space="preserve">needs</w:t>
+      </w:r>
+      <w:r>
+        <w:t xml:space="preserve"> </w:t>
+      </w:r>
+      <w:r>
+        <w:rPr>
+          <w:rStyle w:val="VerbatimChar"/>
+        </w:rPr>
+        <w:t xml:space="preserve">exp.gfa_row</w:t>
+      </w:r>
+      <w:r>
+        <w:t xml:space="preserve">’s</w:t>
+      </w:r>
+      <w:r>
+        <w:t xml:space="preserve"> </w:t>
+      </w:r>
+      <w:r>
+        <w:rPr>
+          <w:rStyle w:val="VerbatimChar"/>
+        </w:rPr>
+        <w:t xml:space="preserve">FWHM_ASEC</w:t>
+      </w:r>
+      <w:r>
+        <w:t xml:space="preserve"> </w:t>
+      </w:r>
+      <w:r>
+        <w:t xml:space="preserve">+</w:t>
+      </w:r>
+      <w:r>
+        <w:t xml:space="preserve"> </w:t>
+      </w:r>
+      <w:r>
+        <w:rPr>
+          <w:rStyle w:val="VerbatimChar"/>
+        </w:rPr>
+        <w:t xml:space="preserve">desimodel</w:t>
+      </w:r>
+      <w:r>
+        <w:t xml:space="preserve">;</w:t>
+      </w:r>
+      <w:r>
+        <w:t xml:space="preserve"> </w:t>
+      </w:r>
+      <w:r>
+        <w:rPr>
+          <w:rStyle w:val="VerbatimChar"/>
+        </w:rPr>
+        <w:t xml:space="preserve">L_field</w:t>
+      </w:r>
+      <w:r>
+        <w:t xml:space="preserve"> </w:t>
+      </w:r>
+      <w:r>
+        <w:t xml:space="preserve">also needs the ETC per-frame guide drift (</w:t>
+      </w:r>
+      <w:r>
+        <w:rPr>
+          <w:rStyle w:val="VerbatimChar"/>
+        </w:rPr>
+        <w:t xml:space="preserve">exp.etc['thru']</w:t>
+      </w:r>
+      <w:r>
+        <w:t xml:space="preserve">) +</w:t>
+      </w:r>
+      <w:r>
+        <w:t xml:space="preserve"> </w:t>
+      </w:r>
+      <w:r>
+        <w:rPr>
+          <w:rStyle w:val="VerbatimChar"/>
+        </w:rPr>
+        <w:t xml:space="preserve">exp.parallactic</w:t>
+      </w:r>
+      <w:r>
+        <w:t xml:space="preserve">.</w:t>
+      </w:r>
+    </w:p>
+    <w:p>
+      <w:pPr>
+        <w:pStyle w:val="BodyText"/>
+      </w:pPr>
+      <w:r>
+        <w:rPr>
+          <w:rStyle w:val="VerbatimChar"/>
+        </w:rPr>
+        <w:t xml:space="preserve">None</w:t>
+      </w:r>
+      <w:r>
+        <w:t xml:space="preserve"> </w:t>
+      </w:r>
+      <w:r>
+        <w:t xml:space="preserve">when unavailable:</w:t>
+      </w:r>
+      <w:r>
+        <w:t xml:space="preserve"> </w:t>
+      </w:r>
+      <w:r>
+        <w:rPr>
+          <w:rStyle w:val="VerbatimChar"/>
+        </w:rPr>
+        <w:t xml:space="preserve">L_see</w:t>
+      </w:r>
+      <w:r>
+        <w:t xml:space="preserve"> </w:t>
+      </w:r>
+      <w:r>
+        <w:t xml:space="preserve">for any exposure without GFA seeing;</w:t>
+      </w:r>
+      <w:r>
+        <w:t xml:space="preserve"> </w:t>
+      </w:r>
+      <w:r>
+        <w:rPr>
+          <w:rStyle w:val="VerbatimChar"/>
+        </w:rPr>
+        <w:t xml:space="preserve">L_field</w:t>
+      </w:r>
+      <w:r>
+        <w:t xml:space="preserve"> </w:t>
+      </w:r>
+      <w:r>
+        <w:t xml:space="preserve">additionally for too-short</w:t>
+      </w:r>
+      <w:r>
+        <w:t xml:space="preserve"> </w:t>
+      </w:r>
+      <w:r>
+        <w:t xml:space="preserve">exposures (no intra-exposure drift to measure).</w:t>
+      </w:r>
+      <w:r>
+        <w:t xml:space="preserve"> </w:t>
+      </w:r>
+      <w:r>
+        <w:rPr>
+          <w:rStyle w:val="VerbatimChar"/>
+        </w:rPr>
+        <w:t xml:space="preserve">L_field</w:t>
+      </w:r>
+      <w:r>
+        <w:t xml:space="preserve">’s</w:t>
+      </w:r>
+      <w:r>
+        <w:t xml:space="preserve"> </w:t>
+      </w:r>
+      <w:r>
+        <w:rPr>
+          <w:i/>
+          <w:iCs/>
+        </w:rPr>
+        <w:t xml:space="preserve">absolute</w:t>
+      </w:r>
+      <w:r>
+        <w:t xml:space="preserve"> </w:t>
+      </w:r>
+      <w:r>
+        <w:t xml:space="preserve">magnitude is approximate above airmass</w:t>
+      </w:r>
+      <w:r>
+        <w:t xml:space="preserve"> </w:t>
+      </w:r>
+      <w:r>
+        <w:t xml:space="preserve">≈ 1.8 (see the report); it is reliable for detection / relative use at all airmass.</w:t>
+      </w:r>
+    </w:p>
+    <w:p>
+      <w:pPr>
+        <w:pStyle w:val="BodyText"/>
+      </w:pPr>
+      <w:r>
+        <w:t xml:space="preserve">To enable the table fallback (e.g. at KPNO), build the table once with</w:t>
+      </w:r>
+      <w:r>
+        <w:t xml:space="preserve"> </w:t>
+      </w:r>
+      <w:r>
+        <w:rPr>
+          <w:rStyle w:val="VerbatimChar"/>
+        </w:rPr>
+        <w:t xml:space="preserve">scripts/build_fiber_loss_metrics.py</w:t>
+      </w:r>
+      <w:r>
+        <w:t xml:space="preserve">,</w:t>
+      </w:r>
+      <w:r>
+        <w:t xml:space="preserve"> </w:t>
+      </w:r>
+      <w:r>
+        <w:t xml:space="preserve">then register it process-wide:</w:t>
+      </w:r>
+    </w:p>
+    <w:p>
+      <w:pPr>
+        <w:pStyle w:val="SourceCode"/>
+      </w:pPr>
+      <w:r>
+        <w:rPr>
+          <w:rStyle w:val="ImportTok"/>
+        </w:rPr>
+        <w:t xml:space="preserve">from</w:t>
+      </w:r>
+      <w:r>
+        <w:rPr>
+          <w:rStyle w:val="NormalTok"/>
+        </w:rPr>
+        <w:t xml:space="preserve"> telemetry_mining.tables </w:t>
+      </w:r>
+      <w:r>
+        <w:rPr>
+          <w:rStyle w:val="ImportTok"/>
+        </w:rPr>
+        <w:t xml:space="preserve">import</w:t>
+      </w:r>
+      <w:r>
+        <w:rPr>
+          <w:rStyle w:val="NormalTok"/>
+        </w:rPr>
+        <w:t xml:space="preserve"> TableSource, DEFAULT_TABLE_SOURCES</w:t>
+      </w:r>
+      <w:r>
+        <w:br/>
+      </w:r>
+      <w:r>
+        <w:rPr>
+          <w:rStyle w:val="NormalTok"/>
+        </w:rPr>
+        <w:t xml:space="preserve">DEFAULT_TABLE_SOURCES.append(</w:t>
+      </w:r>
+      <w:r>
+        <w:br/>
+      </w:r>
+      <w:r>
+        <w:rPr>
+          <w:rStyle w:val="NormalTok"/>
+        </w:rPr>
+        <w:t xml:space="preserve">    TableSource(</w:t>
+      </w:r>
+      <w:r>
+        <w:rPr>
+          <w:rStyle w:val="StringTok"/>
+        </w:rPr>
+        <w:t xml:space="preserve">"fiber_loss_metrics"</w:t>
+      </w:r>
+      <w:r>
+        <w:rPr>
+          <w:rStyle w:val="NormalTok"/>
+        </w:rPr>
+        <w:t xml:space="preserve">, path</w:t>
+      </w:r>
+      <w:r>
+        <w:rPr>
+          <w:rStyle w:val="OperatorTok"/>
+        </w:rPr>
+        <w:t xml:space="preserve">=</w:t>
+      </w:r>
+      <w:r>
+        <w:rPr>
+          <w:rStyle w:val="StringTok"/>
+        </w:rPr>
+        <w:t xml:space="preserve">"data/fiber_loss_metrics.parquet"</w:t>
+      </w:r>
+      <w:r>
+        <w:rPr>
+          <w:rStyle w:val="NormalTok"/>
+        </w:rPr>
+        <w:t xml:space="preserve">, index_column</w:t>
+      </w:r>
+      <w:r>
+        <w:rPr>
+          <w:rStyle w:val="OperatorTok"/>
+        </w:rPr>
+        <w:t xml:space="preserve">=</w:t>
+      </w:r>
+      <w:r>
+        <w:rPr>
+          <w:rStyle w:val="StringTok"/>
+        </w:rPr>
+        <w:t xml:space="preserve">"EXPID"</w:t>
+      </w:r>
+      <w:r>
+        <w:rPr>
+          <w:rStyle w:val="NormalTok"/>
+        </w:rPr>
+        <w:t xml:space="preserve">))</w:t>
+      </w:r>
+    </w:p>
+    <w:p>
+      <w:pPr>
+        <w:pStyle w:val="FirstParagraph"/>
+      </w:pPr>
+      <w:r>
+        <w:t xml:space="preserve">The math itself is in</w:t>
+      </w:r>
+      <w:r>
+        <w:t xml:space="preserve"> </w:t>
+      </w:r>
+      <w:r>
+        <w:rPr>
+          <w:rStyle w:val="VerbatimChar"/>
+        </w:rPr>
+        <w:t xml:space="preserve">telemetry_mining.fiber_loss</w:t>
+      </w:r>
+      <w:r>
+        <w:t xml:space="preserve"> </w:t>
+      </w:r>
+      <w:r>
+        <w:t xml:space="preserve">(</w:t>
+      </w:r>
+      <w:r>
+        <w:rPr>
+          <w:rStyle w:val="VerbatimChar"/>
+        </w:rPr>
+        <w:t xml:space="preserve">l_see_from_fwhm</w:t>
+      </w:r>
+      <w:r>
+        <w:t xml:space="preserve">,</w:t>
+      </w:r>
+      <w:r>
+        <w:t xml:space="preserve"> </w:t>
+      </w:r>
+      <w:r>
+        <w:rPr>
+          <w:rStyle w:val="VerbatimChar"/>
+        </w:rPr>
+        <w:t xml:space="preserve">sheardrift_from_thru</w:t>
+      </w:r>
+      <w:r>
+        <w:t xml:space="preserve">,</w:t>
+      </w:r>
+      <w:r>
+        <w:t xml:space="preserve"> </w:t>
+      </w:r>
+      <w:r>
+        <w:rPr>
+          <w:rStyle w:val="VerbatimChar"/>
+        </w:rPr>
+        <w:t xml:space="preserve">l_field_from_drift</w:t>
+      </w:r>
+      <w:r>
+        <w:t xml:space="preserve">) — shared with the precompute script so table and live attribute can’t diverge.</w:t>
+      </w:r>
+    </w:p>
+    <w:bookmarkEnd w:id="31"/>
+    <w:bookmarkStart w:id="32" w:name="fiberqa"/>
     <w:p>
       <w:pPr>
         <w:pStyle w:val="Heading3"/>
@@ -16945,8 +17570,8 @@
         <w:t xml:space="preserve">been pruned or never existed.</w:t>
       </w:r>
     </w:p>
-    <w:bookmarkEnd w:id="31"/>
-    <w:bookmarkStart w:id="32" w:name="petalqa"/>
+    <w:bookmarkEnd w:id="32"/>
+    <w:bookmarkStart w:id="33" w:name="petalqa"/>
     <w:p>
       <w:pPr>
         <w:pStyle w:val="Heading3"/>
@@ -17476,8 +18101,8 @@
         <w:t xml:space="preserve">values.</w:t>
       </w:r>
     </w:p>
-    <w:bookmarkEnd w:id="32"/>
-    <w:bookmarkStart w:id="33" w:name="fiberqa-per-fiber-table"/>
+    <w:bookmarkEnd w:id="33"/>
+    <w:bookmarkStart w:id="34" w:name="fiberqa-per-fiber-table"/>
     <w:p>
       <w:pPr>
         <w:pStyle w:val="Heading3"/>
@@ -17717,8 +18342,8 @@
         <w:t xml:space="preserve">for the full list.</w:t>
       </w:r>
     </w:p>
-    <w:bookmarkEnd w:id="33"/>
-    <w:bookmarkStart w:id="34" w:name="standard-star-flux-calibration-table"/>
+    <w:bookmarkEnd w:id="34"/>
+    <w:bookmarkStart w:id="35" w:name="standard-star-flux-calibration-table"/>
     <w:p>
       <w:pPr>
         <w:pStyle w:val="Heading3"/>
@@ -18405,8 +19030,8 @@
         <w:t xml:space="preserve">.</w:t>
       </w:r>
     </w:p>
-    <w:bookmarkEnd w:id="34"/>
-    <w:bookmarkStart w:id="35" w:name="custom-table-sources"/>
+    <w:bookmarkEnd w:id="35"/>
+    <w:bookmarkStart w:id="36" w:name="custom-table-sources"/>
     <w:p>
       <w:pPr>
         <w:pStyle w:val="Heading3"/>
@@ -19995,8 +20620,8 @@
         <w:t xml:space="preserve">lists all options.</w:t>
       </w:r>
     </w:p>
-    <w:bookmarkEnd w:id="35"/>
-    <w:bookmarkStart w:id="36" w:name="convenience"/>
+    <w:bookmarkEnd w:id="36"/>
+    <w:bookmarkStart w:id="37" w:name="convenience"/>
     <w:p>
       <w:pPr>
         <w:pStyle w:val="Heading3"/>
@@ -20216,9 +20841,9 @@
         <w:t xml:space="preserve">(bool).</w:t>
       </w:r>
     </w:p>
-    <w:bookmarkEnd w:id="36"/>
     <w:bookmarkEnd w:id="37"/>
-    <w:bookmarkStart w:id="38" w:name="bulk-exposure-lookups"/>
+    <w:bookmarkEnd w:id="38"/>
+    <w:bookmarkStart w:id="39" w:name="bulk-exposure-lookups"/>
     <w:p>
       <w:pPr>
         <w:pStyle w:val="Heading2"/>
@@ -21154,8 +21779,8 @@
         <w:t xml:space="preserve">).</w:t>
       </w:r>
     </w:p>
-    <w:bookmarkEnd w:id="38"/>
-    <w:bookmarkStart w:id="40" w:name="X8067a71839955416a715d6d23f840e8dd0be4d4"/>
+    <w:bookmarkEnd w:id="39"/>
+    <w:bookmarkStart w:id="41" w:name="X71d422aa2d1c304495ca1721e3467f105ff072e"/>
     <w:p>
       <w:pPr>
         <w:pStyle w:val="Heading2"/>
@@ -26351,7 +26976,7 @@
         <w:t xml:space="preserve">).mean())</w:t>
       </w:r>
     </w:p>
-    <w:bookmarkStart w:id="39" w:name="columnvalue-specs"/>
+    <w:bookmarkStart w:id="40" w:name="columnvalue-specs"/>
     <w:p>
       <w:pPr>
         <w:pStyle w:val="Heading3"/>
@@ -26754,9 +27379,9 @@
         <w:t xml:space="preserve">])</w:t>
       </w:r>
     </w:p>
-    <w:bookmarkEnd w:id="39"/>
     <w:bookmarkEnd w:id="40"/>
-    <w:bookmarkStart w:id="41" w:name="exposurepaths"/>
+    <w:bookmarkEnd w:id="41"/>
+    <w:bookmarkStart w:id="42" w:name="exposurepaths"/>
     <w:p>
       <w:pPr>
         <w:pStyle w:val="Heading2"/>
@@ -27400,8 +28025,8 @@
         </w:tc>
       </w:tr>
     </w:tbl>
-    <w:bookmarkEnd w:id="41"/>
-    <w:bookmarkStart w:id="42" w:name="errors"/>
+    <w:bookmarkEnd w:id="42"/>
+    <w:bookmarkStart w:id="43" w:name="errors"/>
     <w:p>
       <w:pPr>
         <w:pStyle w:val="Heading2"/>
@@ -27770,8 +28395,8 @@
         <w:t xml:space="preserve">) or the DB being unreachable.</w:t>
       </w:r>
     </w:p>
-    <w:bookmarkEnd w:id="42"/>
-    <w:bookmarkStart w:id="43" w:name="command-line"/>
+    <w:bookmarkEnd w:id="43"/>
+    <w:bookmarkStart w:id="44" w:name="command-line"/>
     <w:p>
       <w:pPr>
         <w:pStyle w:val="Heading2"/>
@@ -27817,8 +28442,8 @@
         <w:t xml:space="preserve">quick smoke test that the environment/DB/filesystem are all reachable.</w:t>
       </w:r>
     </w:p>
-    <w:bookmarkEnd w:id="43"/>
-    <w:bookmarkStart w:id="54" w:name="module-reference"/>
+    <w:bookmarkEnd w:id="44"/>
+    <w:bookmarkStart w:id="55" w:name="module-reference"/>
     <w:p>
       <w:pPr>
         <w:pStyle w:val="Heading2"/>
@@ -27994,7 +28619,7 @@
         <w:t xml:space="preserve">rather than repeated.</w:t>
       </w:r>
     </w:p>
-    <w:bookmarkStart w:id="44" w:name="Xa59d975ed125dea1f13538346f10106863eb4e4"/>
+    <w:bookmarkStart w:id="45" w:name="Xb69cb50ae844f6a7da320b1514adae8da314bb0"/>
     <w:p>
       <w:pPr>
         <w:pStyle w:val="Heading3"/>
@@ -30166,8 +30791,8 @@
         <w:t xml:space="preserve">tests/cleanup; you don’t need it in normal notebook use.</w:t>
       </w:r>
     </w:p>
-    <w:bookmarkEnd w:id="44"/>
-    <w:bookmarkStart w:id="45" w:name="Xccd6f9066d044263b3fe13dd1c02068c1d53de1"/>
+    <w:bookmarkEnd w:id="45"/>
+    <w:bookmarkStart w:id="46" w:name="X94a3f8fe53d098de6a67e1451d9b80e79f42f0b"/>
     <w:p>
       <w:pPr>
         <w:pStyle w:val="Heading3"/>
@@ -31345,8 +31970,8 @@
         <w:t xml:space="preserve">.</w:t>
       </w:r>
     </w:p>
-    <w:bookmarkEnd w:id="45"/>
-    <w:bookmarkStart w:id="46" w:name="X2ee6c81e7770c22984e9fa5bbabebd5b80c258d"/>
+    <w:bookmarkEnd w:id="46"/>
+    <w:bookmarkStart w:id="47" w:name="Xac3d76dd2a5aa5cb06a0f277e7c45ab8b56ec67"/>
     <w:p>
       <w:pPr>
         <w:pStyle w:val="Heading3"/>
@@ -32018,8 +32643,8 @@
         <w:t xml:space="preserve"># 'all'</w:t>
       </w:r>
     </w:p>
-    <w:bookmarkEnd w:id="46"/>
-    <w:bookmarkStart w:id="47" w:name="X11704954041e3fe4b3dab5adfe61edb19ecd0ba"/>
+    <w:bookmarkEnd w:id="47"/>
+    <w:bookmarkStart w:id="48" w:name="Xabe4c9557eedd69b957863a011080d752aa9711"/>
     <w:p>
       <w:pPr>
         <w:pStyle w:val="Heading3"/>
@@ -32279,8 +32904,8 @@
         <w:t xml:space="preserve">quality-filtered STRICT set).</w:t>
       </w:r>
     </w:p>
-    <w:bookmarkEnd w:id="47"/>
-    <w:bookmarkStart w:id="48" w:name="telemetry_miningetc--etc-json-parsing"/>
+    <w:bookmarkEnd w:id="48"/>
+    <w:bookmarkStart w:id="49" w:name="telemetry_mining.etc-etc-json-parsing"/>
     <w:p>
       <w:pPr>
         <w:pStyle w:val="Heading3"/>
@@ -32690,8 +33315,8 @@
         <w:t xml:space="preserve">]</w:t>
       </w:r>
     </w:p>
-    <w:bookmarkEnd w:id="48"/>
-    <w:bookmarkStart w:id="49" w:name="X75d2e127be49639b6376fd42359dba3d84697a6"/>
+    <w:bookmarkEnd w:id="49"/>
+    <w:bookmarkStart w:id="50" w:name="X704c6af81b8cda5c5c080e1cfeb0ea89c6f9338"/>
     <w:p>
       <w:pPr>
         <w:pStyle w:val="Heading3"/>
@@ -33119,8 +33744,8 @@
         <w:t xml:space="preserve"># one exposure's row, or None</w:t>
       </w:r>
     </w:p>
-    <w:bookmarkEnd w:id="49"/>
-    <w:bookmarkStart w:id="50" w:name="telemetry_miningalarms--alarm-log-search"/>
+    <w:bookmarkEnd w:id="50"/>
+    <w:bookmarkStart w:id="51" w:name="telemetry_mining.alarms-alarm-log-search"/>
     <w:p>
       <w:pPr>
         <w:pStyle w:val="Heading3"/>
@@ -33287,8 +33912,8 @@
         <w:t xml:space="preserve">.</w:t>
       </w:r>
     </w:p>
-    <w:bookmarkEnd w:id="50"/>
-    <w:bookmarkStart w:id="51" w:name="Xf2267d9d3574583336e9d0a58762a99f8a9c89c"/>
+    <w:bookmarkEnd w:id="51"/>
+    <w:bookmarkStart w:id="52" w:name="Xc98e2cf92e9edaf0f794cfb3bfbd26544d12bdb"/>
     <w:p>
       <w:pPr>
         <w:pStyle w:val="Heading3"/>
@@ -34015,8 +34640,8 @@
         <w:t xml:space="preserve">)</w:t>
       </w:r>
     </w:p>
-    <w:bookmarkEnd w:id="51"/>
-    <w:bookmarkStart w:id="52" w:name="X183ae06a4ef47e071b869c793c99e50b3ee6e1a"/>
+    <w:bookmarkEnd w:id="52"/>
+    <w:bookmarkStart w:id="53" w:name="X561d3e19cab9e6618c712ccd69fbad831fb0e40"/>
     <w:p>
       <w:pPr>
         <w:pStyle w:val="Heading3"/>
@@ -34292,8 +34917,8 @@
         <w:t xml:space="preserve">.</w:t>
       </w:r>
     </w:p>
-    <w:bookmarkEnd w:id="52"/>
-    <w:bookmarkStart w:id="53" w:name="X09ecfb933ad8e9ecabf04660013266d39e68291"/>
+    <w:bookmarkEnd w:id="53"/>
+    <w:bookmarkStart w:id="54" w:name="X24b8685442b78e46e9a6defe038dacd4337e7ce"/>
     <w:p>
       <w:pPr>
         <w:pStyle w:val="Heading3"/>
@@ -34395,9 +35020,9 @@
         <w:t xml:space="preserve">.</w:t>
       </w:r>
     </w:p>
-    <w:bookmarkEnd w:id="53"/>
     <w:bookmarkEnd w:id="54"/>
-    <w:bookmarkStart w:id="55" w:name="caching-and-cost-model"/>
+    <w:bookmarkEnd w:id="55"/>
+    <w:bookmarkStart w:id="56" w:name="caching-and-cost-model"/>
     <w:p>
       <w:pPr>
         <w:pStyle w:val="Heading2"/>
@@ -35796,8 +36421,8 @@
         <w:t xml:space="preserve">generally as single-thread/single-notebook-cell use.</w:t>
       </w:r>
     </w:p>
-    <w:bookmarkEnd w:id="55"/>
-    <w:bookmarkStart w:id="56" w:name="known-gotchas"/>
+    <w:bookmarkEnd w:id="56"/>
+    <w:bookmarkStart w:id="57" w:name="known-gotchas"/>
     <w:p>
       <w:pPr>
         <w:pStyle w:val="Heading2"/>
@@ -37260,8 +37885,8 @@
         <w:t xml:space="preserve">product, not something anyone at KPNO has verified.</w:t>
       </w:r>
     </w:p>
-    <w:bookmarkEnd w:id="56"/>
     <w:bookmarkEnd w:id="57"/>
+    <w:bookmarkEnd w:id="58"/>
     <w:sectPr>
       <w:footnotePr>
         <w:numRestart w:val="eachSect"/>

</xml_diff>